<commit_message>
Bâtiment 30x10 : piliers IPE 220, dallage 20 cm, semelles 80x80 HA12, fichier Excel modifiable
- Piliers IPE 220 encadrés de 2 poteaux BA 15x15, contreventements en cornières 50x50x5
- Semelles isolées 80x80x30 (fond -1,20) en HA12, fûts 40x40 et tiges d'ancrage M20
- Dallage BA 20 cm double nappe HA10 sur latérite compactée par couches de 20 cm (20 à 40 cm)
- Option toiture : pannes Z 120x2 et tôles bacs 5 ondulations
- Classeur Excel à formules (paramètres, prix, aciers, métré, sous-détails, DS, DQE, matériaux)
- Esquisse, DQE et déboursé sec Word régénérés à partir du même modèle

Co-Authored-By: Claude Opus 5.5 <noreply@anthropic.com>
Claude-Session: https://claude.ai/code/session_01Y2qTq9Y3zXHLMLHGTW5fBh
</commit_message>
<xml_diff>
--- a/docs/projets/batiment-industriel-30x10/01_Esquisse_Batiment_Industriel_30x10.docx
+++ b/docs/projets/batiment-industriel-30x10/01_Esquisse_Batiment_Industriel_30x10.docx
@@ -24,7 +24,7 @@
           <w:i/>
           <w:sz w:val="22"/>
         </w:rPr>
-        <w:t>Murs en agglos 15 pleins - Piliers BA tous les 5,00 m - Entrée 6,00 m - Toiture 2 versants pente 20 %</w:t>
+        <w:t>Piliers IPE 220 tous les 5,00 m + poteaux BA - Murs en agglos 15 pleins - Dallage BA 20 cm - Toiture 2 versants pente 20 %</w:t>
       </w:r>
     </w:p>
     <w:p>
@@ -52,7 +52,7 @@
         </w:trPr>
         <w:tc>
           <w:tcPr>
-            <w:tcW w:type="dxa" w:w="3402"/>
+            <w:tcW w:type="dxa" w:w="2835"/>
             <w:shd w:val="clear" w:color="auto" w:fill="1F3A5F"/>
           </w:tcPr>
           <w:p>
@@ -72,7 +72,7 @@
         </w:tc>
         <w:tc>
           <w:tcPr>
-            <w:tcW w:type="dxa" w:w="10772"/>
+            <w:tcW w:type="dxa" w:w="11622"/>
             <w:shd w:val="clear" w:color="auto" w:fill="1F3A5F"/>
           </w:tcPr>
           <w:p>
@@ -94,7 +94,7 @@
       <w:tr>
         <w:tc>
           <w:tcPr>
-            <w:tcW w:type="dxa" w:w="3402"/>
+            <w:tcW w:type="dxa" w:w="2835"/>
           </w:tcPr>
           <w:p>
             <w:r/>
@@ -108,7 +108,7 @@
         </w:tc>
         <w:tc>
           <w:tcPr>
-            <w:tcW w:type="dxa" w:w="10772"/>
+            <w:tcW w:type="dxa" w:w="11622"/>
           </w:tcPr>
           <w:p>
             <w:r/>
@@ -124,7 +124,67 @@
       <w:tr>
         <w:tc>
           <w:tcPr>
-            <w:tcW w:type="dxa" w:w="3402"/>
+            <w:tcW w:type="dxa" w:w="2835"/>
+          </w:tcPr>
+          <w:p>
+            <w:r/>
+            <w:r>
+              <w:rPr>
+                <w:sz w:val="17"/>
+              </w:rPr>
+              <w:t>Ossature</w:t>
+            </w:r>
+          </w:p>
+        </w:tc>
+        <w:tc>
+          <w:tcPr>
+            <w:tcW w:type="dxa" w:w="11622"/>
+          </w:tcPr>
+          <w:p>
+            <w:r/>
+            <w:r>
+              <w:rPr>
+                <w:sz w:val="17"/>
+              </w:rPr>
+              <w:t>17 piliers en IPE 220 (S235) tous les 5,00 m, de ±0,00 à +6,00, sur platine 320x220x15 et 4 tiges d'ancrage M20 ; de part et d'autre de chaque IPE, 2 poteaux BA 15 x 15 (4 HA10, cadres HA6)</w:t>
+            </w:r>
+          </w:p>
+        </w:tc>
+      </w:tr>
+      <w:tr>
+        <w:tc>
+          <w:tcPr>
+            <w:tcW w:type="dxa" w:w="2835"/>
+          </w:tcPr>
+          <w:p>
+            <w:r/>
+            <w:r>
+              <w:rPr>
+                <w:sz w:val="17"/>
+              </w:rPr>
+              <w:t>Contreventements</w:t>
+            </w:r>
+          </w:p>
+        </w:tc>
+        <w:tc>
+          <w:tcPr>
+            <w:tcW w:type="dxa" w:w="11622"/>
+          </w:tcPr>
+          <w:p>
+            <w:r/>
+            <w:r>
+              <w:rPr>
+                <w:sz w:val="17"/>
+              </w:rPr>
+              <w:t>Cornières 50 x 50 x 5 : 4 palées verticales en croix de Saint-André (travées d'extrémité des long pans) + poutre au vent en toiture dans les 2 travées d'extrémité</w:t>
+            </w:r>
+          </w:p>
+        </w:tc>
+      </w:tr>
+      <w:tr>
+        <w:tc>
+          <w:tcPr>
+            <w:tcW w:type="dxa" w:w="2835"/>
           </w:tcPr>
           <w:p>
             <w:r/>
@@ -138,7 +198,7 @@
         </w:tc>
         <w:tc>
           <w:tcPr>
-            <w:tcW w:type="dxa" w:w="10772"/>
+            <w:tcW w:type="dxa" w:w="11622"/>
           </w:tcPr>
           <w:p>
             <w:r/>
@@ -154,7 +214,7 @@
       <w:tr>
         <w:tc>
           <w:tcPr>
-            <w:tcW w:type="dxa" w:w="3402"/>
+            <w:tcW w:type="dxa" w:w="2835"/>
           </w:tcPr>
           <w:p>
             <w:r/>
@@ -168,7 +228,7 @@
         </w:tc>
         <w:tc>
           <w:tcPr>
-            <w:tcW w:type="dxa" w:w="10772"/>
+            <w:tcW w:type="dxa" w:w="11622"/>
           </w:tcPr>
           <w:p>
             <w:r/>
@@ -176,7 +236,7 @@
               <w:rPr>
                 <w:sz w:val="17"/>
               </w:rPr>
-              <w:t>Bas (+0,00/+0,20), intermédiaire (+3,00/+3,20), haut (+5,80/+6,00) - section 15 x 20</w:t>
+              <w:t>Bas (±0,00/+0,20), intermédiaire (+3,00/+3,20), haut (+5,80/+6,00) - 15 x 20, 4 HA10, cadres HA6 e = 20</w:t>
             </w:r>
           </w:p>
         </w:tc>
@@ -184,7 +244,7 @@
       <w:tr>
         <w:tc>
           <w:tcPr>
-            <w:tcW w:type="dxa" w:w="3402"/>
+            <w:tcW w:type="dxa" w:w="2835"/>
           </w:tcPr>
           <w:p>
             <w:r/>
@@ -192,13 +252,13 @@
               <w:rPr>
                 <w:sz w:val="17"/>
               </w:rPr>
-              <w:t>Ferraillage</w:t>
+              <w:t>Fondations</w:t>
             </w:r>
           </w:p>
         </w:tc>
         <w:tc>
           <w:tcPr>
-            <w:tcW w:type="dxa" w:w="10772"/>
+            <w:tcW w:type="dxa" w:w="11622"/>
           </w:tcPr>
           <w:p>
             <w:r/>
@@ -206,7 +266,7 @@
               <w:rPr>
                 <w:sz w:val="17"/>
               </w:rPr>
-              <w:t>Armatures longitudinales HA10 - étriers/cadres HA6 (FeE500)</w:t>
+              <w:t>Semelles isolées 80 x 80 x 30 sous piliers, fond de fouille à -1,20 m, nappe HA12 e = 15 dans les 2 sens, fût BA 40 x 40 (4 HA12) jusqu'à ±0,00 ; semelle filante 40 x 15 (4 HA10) sous les murs</w:t>
             </w:r>
           </w:p>
         </w:tc>
@@ -214,7 +274,7 @@
       <w:tr>
         <w:tc>
           <w:tcPr>
-            <w:tcW w:type="dxa" w:w="3402"/>
+            <w:tcW w:type="dxa" w:w="2835"/>
           </w:tcPr>
           <w:p>
             <w:r/>
@@ -222,13 +282,13 @@
               <w:rPr>
                 <w:sz w:val="17"/>
               </w:rPr>
-              <w:t>Piliers</w:t>
+              <w:t>Dallage</w:t>
             </w:r>
           </w:p>
         </w:tc>
         <w:tc>
           <w:tcPr>
-            <w:tcW w:type="dxa" w:w="10772"/>
+            <w:tcW w:type="dxa" w:w="11622"/>
           </w:tcPr>
           <w:p>
             <w:r/>
@@ -236,7 +296,7 @@
               <w:rPr>
                 <w:sz w:val="17"/>
               </w:rPr>
-              <w:t>17 piliers BA tous les 5,00 m ; chaque pilier = 2 poteaux 15 x 20 jumelés (15 x 40), 8 HA10</w:t>
+              <w:t>Béton armé 20 cm dosé à 350 kg/m³, double nappe HA10 FeE500 e = 20 cm, polyane, joints sciés 5 x 5 m</w:t>
             </w:r>
           </w:p>
         </w:tc>
@@ -244,7 +304,37 @@
       <w:tr>
         <w:tc>
           <w:tcPr>
-            <w:tcW w:type="dxa" w:w="3402"/>
+            <w:tcW w:type="dxa" w:w="2835"/>
+          </w:tcPr>
+          <w:p>
+            <w:r/>
+            <w:r>
+              <w:rPr>
+                <w:sz w:val="17"/>
+              </w:rPr>
+              <w:t>Forme sous dallage</w:t>
+            </w:r>
+          </w:p>
+        </w:tc>
+        <w:tc>
+          <w:tcPr>
+            <w:tcW w:type="dxa" w:w="11622"/>
+          </w:tcPr>
+          <w:p>
+            <w:r/>
+            <w:r>
+              <w:rPr>
+                <w:sz w:val="17"/>
+              </w:rPr>
+              <w:t>Purge et rechargement en latérite par couches de 20 cm compactées à 95 % OPM : 40 cm si le sol est de mauvaise portance, 20 cm sinon</w:t>
+            </w:r>
+          </w:p>
+        </w:tc>
+      </w:tr>
+      <w:tr>
+        <w:tc>
+          <w:tcPr>
+            <w:tcW w:type="dxa" w:w="2835"/>
           </w:tcPr>
           <w:p>
             <w:r/>
@@ -258,7 +348,7 @@
         </w:tc>
         <w:tc>
           <w:tcPr>
-            <w:tcW w:type="dxa" w:w="10772"/>
+            <w:tcW w:type="dxa" w:w="11622"/>
           </w:tcPr>
           <w:p>
             <w:r/>
@@ -274,7 +364,7 @@
       <w:tr>
         <w:tc>
           <w:tcPr>
-            <w:tcW w:type="dxa" w:w="3402"/>
+            <w:tcW w:type="dxa" w:w="2835"/>
           </w:tcPr>
           <w:p>
             <w:r/>
@@ -282,13 +372,13 @@
               <w:rPr>
                 <w:sz w:val="17"/>
               </w:rPr>
-              <w:t>Toiture</w:t>
+              <w:t>Toiture (option)</w:t>
             </w:r>
           </w:p>
         </w:tc>
         <w:tc>
           <w:tcPr>
-            <w:tcW w:type="dxa" w:w="10772"/>
+            <w:tcW w:type="dxa" w:w="11622"/>
           </w:tcPr>
           <w:p>
             <w:r/>
@@ -296,67 +386,7 @@
               <w:rPr>
                 <w:sz w:val="17"/>
               </w:rPr>
-              <w:t>Deux versants, pente 20 % → flèche 1,00 m, faîtage à +7,00 m, pignons triangulaires</w:t>
-            </w:r>
-          </w:p>
-        </w:tc>
-      </w:tr>
-      <w:tr>
-        <w:tc>
-          <w:tcPr>
-            <w:tcW w:type="dxa" w:w="3402"/>
-          </w:tcPr>
-          <w:p>
-            <w:r/>
-            <w:r>
-              <w:rPr>
-                <w:sz w:val="17"/>
-              </w:rPr>
-              <w:t>Fondations</w:t>
-            </w:r>
-          </w:p>
-        </w:tc>
-        <w:tc>
-          <w:tcPr>
-            <w:tcW w:type="dxa" w:w="10772"/>
-          </w:tcPr>
-          <w:p>
-            <w:r/>
-            <w:r>
-              <w:rPr>
-                <w:sz w:val="17"/>
-              </w:rPr>
-              <w:t>Semelle filante BA 40 x 20 sous murs + semelles isolées 100 x 100 x 30 sous piliers, fond de fouille à -1,25/-1,40</w:t>
-            </w:r>
-          </w:p>
-        </w:tc>
-      </w:tr>
-      <w:tr>
-        <w:tc>
-          <w:tcPr>
-            <w:tcW w:type="dxa" w:w="3402"/>
-          </w:tcPr>
-          <w:p>
-            <w:r/>
-            <w:r>
-              <w:rPr>
-                <w:sz w:val="17"/>
-              </w:rPr>
-              <w:t>Matériaux</w:t>
-            </w:r>
-          </w:p>
-        </w:tc>
-        <w:tc>
-          <w:tcPr>
-            <w:tcW w:type="dxa" w:w="10772"/>
-          </w:tcPr>
-          <w:p>
-            <w:r/>
-            <w:r>
-              <w:rPr>
-                <w:sz w:val="17"/>
-              </w:rPr>
-              <w:t>Béton dosé à 350 kg/m³ (≈ C25/30), CPJ 42,5, sable lavé, gravier concassé</w:t>
+              <w:t>Deux versants, pente 20 % → faîtage à +7,00 m ; fermes, pannes Z 120 x 2 (entraxe ≤ 1,20 m), tôles bacs 5 ondulations</w:t>
             </w:r>
           </w:p>
         </w:tc>
@@ -376,7 +406,7 @@
         <w:pStyle w:val="ListBullet"/>
       </w:pPr>
       <w:r>
-        <w:t>« Autour de chaque pilier deux poteaux » a été interprété comme : chaque pilier est constitué de 2 poteaux 15 x 20 jumelés (section totale 15 x 40, dans l'épaisseur du mur agglo 15), posés sur une semelle isolée commune. Si vous entendiez 2 poteaux distincts de part et d'autre de chaque pilier, je mets à jour le métré.</w:t>
+        <w:t>« Autour de chaque pilier deux poteaux » : chaque pilier IPE 220 est encadré par 2 poteaux BA 15 x 15 (un de chaque côté, dans l'épaisseur du mur) qui lient la maçonnerie et les chaînages à l'ossature métallique.</w:t>
       </w:r>
     </w:p>
     <w:p>
@@ -384,7 +414,7 @@
         <w:pStyle w:val="ListBullet"/>
       </w:pPr>
       <w:r>
-        <w:t>Disposition des piliers : 7 piliers par long pan (axes 1 à 7), 1 pilier au centre du pignon Ouest, 2 piliers d'encadrement de l'entrée sur le pignon Est (le pilier central y est supprimé) → 17 piliers au total.</w:t>
+        <w:t>Les tiges d'ancrage (4 M20 par pilier) sont scellées dans un fût BA 40 x 40 coulé sur la semelle 80 x 80 ; la platine est à ±0,00 et noyée dans le dallage.</w:t>
       </w:r>
     </w:p>
     <w:p>
@@ -392,7 +422,7 @@
         <w:pStyle w:val="ListBullet"/>
       </w:pPr>
       <w:r>
-        <w:t>Pente 20 % appliquée à une toiture à 2 versants de 5,00 m chacun (flèche = 5,00 x 0,20 = 1,00 m).</w:t>
+        <w:t>Disposition : 7 piliers par long pan, 1 au centre du pignon Ouest, 2 piliers d'encadrement de l'entrée sur le pignon Est → 17 piliers.</w:t>
       </w:r>
     </w:p>
     <w:p>
@@ -400,7 +430,7 @@
         <w:pStyle w:val="ListBullet"/>
       </w:pPr>
       <w:r>
-        <w:t>Hauteur 6,00 m comptée du terrain naturel (±0,00) au dessus du chaînage haut ; fondation 1,00 m sous le TN.</w:t>
+        <w:t>Rechargement en latérite chiffré pour 40 cm (cas défavorable) ; mettre p_EPLAT = 0,20 dans le fichier Excel si les essais montrent une bonne portance.</w:t>
       </w:r>
     </w:p>
     <w:p>
@@ -408,7 +438,7 @@
         <w:pStyle w:val="ListBullet"/>
       </w:pPr>
       <w:r>
-        <w:t>Entrée 6,00 m placée au centre du pignon Est (2,00 m de mur de chaque côté).</w:t>
+        <w:t>Le gros œuvre comprend les lots 0 à 5 (y compris la structure métallique) ; la charpente de toiture et la couverture, les enduits et le portail sont chiffrés en options (lots 6 à 8).</w:t>
       </w:r>
     </w:p>
     <w:p>
@@ -416,7 +446,7 @@
         <w:pStyle w:val="ListBullet"/>
       </w:pPr>
       <w:r>
-        <w:t>Note vocale WhatsApp jointe : elle n'a pas pu être transcrite ; seul le texte du message a été utilisé.</w:t>
+        <w:t>Note vocale WhatsApp : elle n'a pas pu être transcrite ; seuls les messages écrits ont été utilisés.</w:t>
       </w:r>
     </w:p>
     <w:p>
@@ -439,7 +469,7 @@
       <w:r>
         <w:drawing>
           <wp:inline xmlns:a="http://schemas.openxmlformats.org/drawingml/2006/main" xmlns:pic="http://schemas.openxmlformats.org/drawingml/2006/picture">
-            <wp:extent cx="9360000" cy="4546286"/>
+            <wp:extent cx="9360000" cy="4813714"/>
             <wp:docPr id="1" name="Picture 1"/>
             <wp:cNvGraphicFramePr>
               <a:graphicFrameLocks noChangeAspect="1"/>
@@ -460,7 +490,7 @@
                   <pic:spPr>
                     <a:xfrm>
                       <a:off x="0" y="0"/>
-                      <a:ext cx="9360000" cy="4546286"/>
+                      <a:ext cx="9360000" cy="4813714"/>
                     </a:xfrm>
                     <a:prstGeom prst="rect"/>
                   </pic:spPr>
@@ -479,7 +509,7 @@
         <w:rPr>
           <w:i/>
         </w:rPr>
-        <w:t>Plan d'implantation des piliers et des murs</w:t>
+        <w:t>Plan d'implantation - piliers IPE 220, poteaux BA, contreventements</w:t>
       </w:r>
     </w:p>
     <w:p>
@@ -494,7 +524,7 @@
       <w:r>
         <w:drawing>
           <wp:inline xmlns:a="http://schemas.openxmlformats.org/drawingml/2006/main" xmlns:pic="http://schemas.openxmlformats.org/drawingml/2006/picture">
-            <wp:extent cx="9360000" cy="3476571"/>
+            <wp:extent cx="9360000" cy="3744000"/>
             <wp:docPr id="2" name="Picture 2"/>
             <wp:cNvGraphicFramePr>
               <a:graphicFrameLocks noChangeAspect="1"/>
@@ -515,7 +545,7 @@
                   <pic:spPr>
                     <a:xfrm>
                       <a:off x="0" y="0"/>
-                      <a:ext cx="9360000" cy="3476571"/>
+                      <a:ext cx="9360000" cy="3744000"/>
                     </a:xfrm>
                     <a:prstGeom prst="rect"/>
                   </pic:spPr>
@@ -534,7 +564,7 @@
         <w:rPr>
           <w:i/>
         </w:rPr>
-        <w:t>Façade Nord (long pan)</w:t>
+        <w:t>Façade Nord (long pan) - palées de stabilité</w:t>
       </w:r>
     </w:p>
     <w:p>
@@ -549,7 +579,7 @@
       <w:r>
         <w:drawing>
           <wp:inline xmlns:a="http://schemas.openxmlformats.org/drawingml/2006/main" xmlns:pic="http://schemas.openxmlformats.org/drawingml/2006/picture">
-            <wp:extent cx="8228571" cy="5760000"/>
+            <wp:extent cx="7750000" cy="5580000"/>
             <wp:docPr id="3" name="Picture 3"/>
             <wp:cNvGraphicFramePr>
               <a:graphicFrameLocks noChangeAspect="1"/>
@@ -570,7 +600,7 @@
                   <pic:spPr>
                     <a:xfrm>
                       <a:off x="0" y="0"/>
-                      <a:ext cx="8228571" cy="5760000"/>
+                      <a:ext cx="7750000" cy="5580000"/>
                     </a:xfrm>
                     <a:prstGeom prst="rect"/>
                   </pic:spPr>
@@ -604,7 +634,7 @@
       <w:r>
         <w:drawing>
           <wp:inline xmlns:a="http://schemas.openxmlformats.org/drawingml/2006/main" xmlns:pic="http://schemas.openxmlformats.org/drawingml/2006/picture">
-            <wp:extent cx="9216000" cy="5760000"/>
+            <wp:extent cx="8718750" cy="5580000"/>
             <wp:docPr id="4" name="Picture 4"/>
             <wp:cNvGraphicFramePr>
               <a:graphicFrameLocks noChangeAspect="1"/>
@@ -625,7 +655,7 @@
                   <pic:spPr>
                     <a:xfrm>
                       <a:off x="0" y="0"/>
-                      <a:ext cx="9216000" cy="5760000"/>
+                      <a:ext cx="8718750" cy="5580000"/>
                     </a:xfrm>
                     <a:prstGeom prst="rect"/>
                   </pic:spPr>
@@ -659,7 +689,7 @@
       <w:r>
         <w:drawing>
           <wp:inline xmlns:a="http://schemas.openxmlformats.org/drawingml/2006/main" xmlns:pic="http://schemas.openxmlformats.org/drawingml/2006/picture">
-            <wp:extent cx="9360000" cy="3610286"/>
+            <wp:extent cx="8810526" cy="5580000"/>
             <wp:docPr id="5" name="Picture 5"/>
             <wp:cNvGraphicFramePr>
               <a:graphicFrameLocks noChangeAspect="1"/>
@@ -668,7 +698,7 @@
               <a:graphicData uri="http://schemas.openxmlformats.org/drawingml/2006/picture">
                 <pic:pic>
                   <pic:nvPicPr>
-                    <pic:cNvPr id="0" name="05_details_ferraillage.png"/>
+                    <pic:cNvPr id="0" name="05_details.png"/>
                     <pic:cNvPicPr/>
                   </pic:nvPicPr>
                   <pic:blipFill>
@@ -680,7 +710,7 @@
                   <pic:spPr>
                     <a:xfrm>
                       <a:off x="0" y="0"/>
-                      <a:ext cx="9360000" cy="3610286"/>
+                      <a:ext cx="8810526" cy="5580000"/>
                     </a:xfrm>
                     <a:prstGeom prst="rect"/>
                   </pic:spPr>
@@ -699,7 +729,7 @@
         <w:rPr>
           <w:i/>
         </w:rPr>
-        <w:t>Détails de ferraillage type</w:t>
+        <w:t>Détails type</w:t>
       </w:r>
     </w:p>
     <w:p>
@@ -735,7 +765,7 @@
         </w:trPr>
         <w:tc>
           <w:tcPr>
-            <w:tcW w:type="dxa" w:w="2268"/>
+            <w:tcW w:type="dxa" w:w="2381"/>
             <w:shd w:val="clear" w:color="auto" w:fill="1F3A5F"/>
           </w:tcPr>
           <w:p>
@@ -755,7 +785,7 @@
         </w:tc>
         <w:tc>
           <w:tcPr>
-            <w:tcW w:type="dxa" w:w="2381"/>
+            <w:tcW w:type="dxa" w:w="2608"/>
             <w:shd w:val="clear" w:color="auto" w:fill="1F3A5F"/>
           </w:tcPr>
           <w:p>
@@ -775,7 +805,7 @@
         </w:tc>
         <w:tc>
           <w:tcPr>
-            <w:tcW w:type="dxa" w:w="3118"/>
+            <w:tcW w:type="dxa" w:w="2948"/>
             <w:shd w:val="clear" w:color="auto" w:fill="1F3A5F"/>
           </w:tcPr>
           <w:p>
@@ -789,13 +819,13 @@
                 <w:color w:val="FFFFFF"/>
                 <w:sz w:val="17"/>
               </w:rPr>
-              <w:t>Armatures longitudinales</w:t>
+              <w:t>Armatures / profilé</w:t>
             </w:r>
           </w:p>
         </w:tc>
         <w:tc>
           <w:tcPr>
-            <w:tcW w:type="dxa" w:w="3685"/>
+            <w:tcW w:type="dxa" w:w="3515"/>
             <w:shd w:val="clear" w:color="auto" w:fill="1F3A5F"/>
           </w:tcPr>
           <w:p>
@@ -809,13 +839,13 @@
                 <w:color w:val="FFFFFF"/>
                 <w:sz w:val="17"/>
               </w:rPr>
-              <w:t>Armatures transversales</w:t>
+              <w:t>Armatures transversales / assemblage</w:t>
             </w:r>
           </w:p>
         </w:tc>
         <w:tc>
           <w:tcPr>
-            <w:tcW w:type="dxa" w:w="1417"/>
+            <w:tcW w:type="dxa" w:w="1814"/>
             <w:shd w:val="clear" w:color="auto" w:fill="1F3A5F"/>
           </w:tcPr>
           <w:p>
@@ -829,7 +859,7 @@
                 <w:color w:val="FFFFFF"/>
                 <w:sz w:val="17"/>
               </w:rPr>
-              <w:t>Béton</w:t>
+              <w:t>Matériau</w:t>
             </w:r>
           </w:p>
         </w:tc>
@@ -837,7 +867,7 @@
       <w:tr>
         <w:tc>
           <w:tcPr>
-            <w:tcW w:type="dxa" w:w="2268"/>
+            <w:tcW w:type="dxa" w:w="2381"/>
           </w:tcPr>
           <w:p>
             <w:r/>
@@ -851,7 +881,7 @@
         </w:tc>
         <w:tc>
           <w:tcPr>
-            <w:tcW w:type="dxa" w:w="2381"/>
+            <w:tcW w:type="dxa" w:w="2608"/>
           </w:tcPr>
           <w:p>
             <w:r/>
@@ -859,13 +889,13 @@
               <w:rPr>
                 <w:sz w:val="17"/>
               </w:rPr>
-              <w:t>1,00 x 1,00 x 0,30</w:t>
+              <w:t>0,80 x 0,80 x 0,30, fond -1,20</w:t>
             </w:r>
           </w:p>
         </w:tc>
         <w:tc>
           <w:tcPr>
-            <w:tcW w:type="dxa" w:w="3118"/>
+            <w:tcW w:type="dxa" w:w="2948"/>
           </w:tcPr>
           <w:p>
             <w:r/>
@@ -873,13 +903,13 @@
               <w:rPr>
                 <w:sz w:val="17"/>
               </w:rPr>
-              <w:t>Nappe 2 x 7 HA10 e = 15 cm</w:t>
+              <w:t>2 x 6 HA12 e = 15 cm (retours 20 cm)</w:t>
             </w:r>
           </w:p>
         </w:tc>
         <w:tc>
           <w:tcPr>
-            <w:tcW w:type="dxa" w:w="3685"/>
+            <w:tcW w:type="dxa" w:w="3515"/>
           </w:tcPr>
           <w:p>
             <w:r/>
@@ -893,7 +923,7 @@
         </w:tc>
         <w:tc>
           <w:tcPr>
-            <w:tcW w:type="dxa" w:w="1417"/>
+            <w:tcW w:type="dxa" w:w="1814"/>
           </w:tcPr>
           <w:p>
             <w:r/>
@@ -901,7 +931,7 @@
               <w:rPr>
                 <w:sz w:val="17"/>
               </w:rPr>
-              <w:t>350 kg/m³</w:t>
+              <w:t>Béton 350 kg/m³</w:t>
             </w:r>
           </w:p>
         </w:tc>
@@ -909,7 +939,367 @@
       <w:tr>
         <w:tc>
           <w:tcPr>
-            <w:tcW w:type="dxa" w:w="2268"/>
+            <w:tcW w:type="dxa" w:w="2381"/>
+          </w:tcPr>
+          <w:p>
+            <w:r/>
+            <w:r>
+              <w:rPr>
+                <w:sz w:val="17"/>
+              </w:rPr>
+              <w:t>Fût sous platine (17 u)</w:t>
+            </w:r>
+          </w:p>
+        </w:tc>
+        <w:tc>
+          <w:tcPr>
+            <w:tcW w:type="dxa" w:w="2608"/>
+          </w:tcPr>
+          <w:p>
+            <w:r/>
+            <w:r>
+              <w:rPr>
+                <w:sz w:val="17"/>
+              </w:rPr>
+              <w:t>0,40 x 0,40, de -0,85 à ±0,00</w:t>
+            </w:r>
+          </w:p>
+        </w:tc>
+        <w:tc>
+          <w:tcPr>
+            <w:tcW w:type="dxa" w:w="2948"/>
+          </w:tcPr>
+          <w:p>
+            <w:r/>
+            <w:r>
+              <w:rPr>
+                <w:sz w:val="17"/>
+              </w:rPr>
+              <w:t>4 HA12 en L</w:t>
+            </w:r>
+          </w:p>
+        </w:tc>
+        <w:tc>
+          <w:tcPr>
+            <w:tcW w:type="dxa" w:w="3515"/>
+          </w:tcPr>
+          <w:p>
+            <w:r/>
+            <w:r>
+              <w:rPr>
+                <w:sz w:val="17"/>
+              </w:rPr>
+              <w:t>Cadres HA6 e = 15 cm</w:t>
+            </w:r>
+          </w:p>
+        </w:tc>
+        <w:tc>
+          <w:tcPr>
+            <w:tcW w:type="dxa" w:w="1814"/>
+          </w:tcPr>
+          <w:p>
+            <w:r/>
+            <w:r>
+              <w:rPr>
+                <w:sz w:val="17"/>
+              </w:rPr>
+              <w:t>Béton 350 kg/m³</w:t>
+            </w:r>
+          </w:p>
+        </w:tc>
+      </w:tr>
+      <w:tr>
+        <w:tc>
+          <w:tcPr>
+            <w:tcW w:type="dxa" w:w="2381"/>
+          </w:tcPr>
+          <w:p>
+            <w:r/>
+            <w:r>
+              <w:rPr>
+                <w:sz w:val="17"/>
+              </w:rPr>
+              <w:t>Tiges d'ancrage</w:t>
+            </w:r>
+          </w:p>
+        </w:tc>
+        <w:tc>
+          <w:tcPr>
+            <w:tcW w:type="dxa" w:w="2608"/>
+          </w:tcPr>
+          <w:p>
+            <w:r/>
+            <w:r>
+              <w:rPr>
+                <w:sz w:val="17"/>
+              </w:rPr>
+              <w:t>4 par pilier (68 u)</w:t>
+            </w:r>
+          </w:p>
+        </w:tc>
+        <w:tc>
+          <w:tcPr>
+            <w:tcW w:type="dxa" w:w="2948"/>
+          </w:tcPr>
+          <w:p>
+            <w:r/>
+            <w:r>
+              <w:rPr>
+                <w:sz w:val="17"/>
+              </w:rPr>
+              <w:t>M20 L = 600 coudées</w:t>
+            </w:r>
+          </w:p>
+        </w:tc>
+        <w:tc>
+          <w:tcPr>
+            <w:tcW w:type="dxa" w:w="3515"/>
+          </w:tcPr>
+          <w:p>
+            <w:r/>
+            <w:r>
+              <w:rPr>
+                <w:sz w:val="17"/>
+              </w:rPr>
+              <w:t>2 écrous + rondelle, gabarit de pose</w:t>
+            </w:r>
+          </w:p>
+        </w:tc>
+        <w:tc>
+          <w:tcPr>
+            <w:tcW w:type="dxa" w:w="1814"/>
+          </w:tcPr>
+          <w:p>
+            <w:r/>
+            <w:r>
+              <w:rPr>
+                <w:sz w:val="17"/>
+              </w:rPr>
+              <w:t>Acier 4.6 / S235</w:t>
+            </w:r>
+          </w:p>
+        </w:tc>
+      </w:tr>
+      <w:tr>
+        <w:tc>
+          <w:tcPr>
+            <w:tcW w:type="dxa" w:w="2381"/>
+          </w:tcPr>
+          <w:p>
+            <w:r/>
+            <w:r>
+              <w:rPr>
+                <w:sz w:val="17"/>
+              </w:rPr>
+              <w:t>Pilier (17 u)</w:t>
+            </w:r>
+          </w:p>
+        </w:tc>
+        <w:tc>
+          <w:tcPr>
+            <w:tcW w:type="dxa" w:w="2608"/>
+          </w:tcPr>
+          <w:p>
+            <w:r/>
+            <w:r>
+              <w:rPr>
+                <w:sz w:val="17"/>
+              </w:rPr>
+              <w:t>IPE 220, ±0,00 → +6,00</w:t>
+            </w:r>
+          </w:p>
+        </w:tc>
+        <w:tc>
+          <w:tcPr>
+            <w:tcW w:type="dxa" w:w="2948"/>
+          </w:tcPr>
+          <w:p>
+            <w:r/>
+            <w:r>
+              <w:rPr>
+                <w:sz w:val="17"/>
+              </w:rPr>
+              <w:t>Platine de pied 320 x 220 x 15 + raidisseurs</w:t>
+            </w:r>
+          </w:p>
+        </w:tc>
+        <w:tc>
+          <w:tcPr>
+            <w:tcW w:type="dxa" w:w="3515"/>
+          </w:tcPr>
+          <w:p>
+            <w:r/>
+            <w:r>
+              <w:rPr>
+                <w:sz w:val="17"/>
+              </w:rPr>
+              <w:t>Calage mortier sans retrait</w:t>
+            </w:r>
+          </w:p>
+        </w:tc>
+        <w:tc>
+          <w:tcPr>
+            <w:tcW w:type="dxa" w:w="1814"/>
+          </w:tcPr>
+          <w:p>
+            <w:r/>
+            <w:r>
+              <w:rPr>
+                <w:sz w:val="17"/>
+              </w:rPr>
+              <w:t>S235, peint</w:t>
+            </w:r>
+          </w:p>
+        </w:tc>
+      </w:tr>
+      <w:tr>
+        <w:tc>
+          <w:tcPr>
+            <w:tcW w:type="dxa" w:w="2381"/>
+          </w:tcPr>
+          <w:p>
+            <w:r/>
+            <w:r>
+              <w:rPr>
+                <w:sz w:val="17"/>
+              </w:rPr>
+              <w:t>Poteaux BA (34 u)</w:t>
+            </w:r>
+          </w:p>
+        </w:tc>
+        <w:tc>
+          <w:tcPr>
+            <w:tcW w:type="dxa" w:w="2608"/>
+          </w:tcPr>
+          <w:p>
+            <w:r/>
+            <w:r>
+              <w:rPr>
+                <w:sz w:val="17"/>
+              </w:rPr>
+              <w:t>15 x 15, de -0,85 à +6,00</w:t>
+            </w:r>
+          </w:p>
+        </w:tc>
+        <w:tc>
+          <w:tcPr>
+            <w:tcW w:type="dxa" w:w="2948"/>
+          </w:tcPr>
+          <w:p>
+            <w:r/>
+            <w:r>
+              <w:rPr>
+                <w:sz w:val="17"/>
+              </w:rPr>
+              <w:t>4 HA10</w:t>
+            </w:r>
+          </w:p>
+        </w:tc>
+        <w:tc>
+          <w:tcPr>
+            <w:tcW w:type="dxa" w:w="3515"/>
+          </w:tcPr>
+          <w:p>
+            <w:r/>
+            <w:r>
+              <w:rPr>
+                <w:sz w:val="17"/>
+              </w:rPr>
+              <w:t>Cadres HA6 e = 15 cm</w:t>
+            </w:r>
+          </w:p>
+        </w:tc>
+        <w:tc>
+          <w:tcPr>
+            <w:tcW w:type="dxa" w:w="1814"/>
+          </w:tcPr>
+          <w:p>
+            <w:r/>
+            <w:r>
+              <w:rPr>
+                <w:sz w:val="17"/>
+              </w:rPr>
+              <w:t>Béton 350 kg/m³</w:t>
+            </w:r>
+          </w:p>
+        </w:tc>
+      </w:tr>
+      <w:tr>
+        <w:tc>
+          <w:tcPr>
+            <w:tcW w:type="dxa" w:w="2381"/>
+          </w:tcPr>
+          <w:p>
+            <w:r/>
+            <w:r>
+              <w:rPr>
+                <w:sz w:val="17"/>
+              </w:rPr>
+              <w:t>Contreventements</w:t>
+            </w:r>
+          </w:p>
+        </w:tc>
+        <w:tc>
+          <w:tcPr>
+            <w:tcW w:type="dxa" w:w="2608"/>
+          </w:tcPr>
+          <w:p>
+            <w:r/>
+            <w:r>
+              <w:rPr>
+                <w:sz w:val="17"/>
+              </w:rPr>
+              <w:t>Croix en L 50 x 50 x 5</w:t>
+            </w:r>
+          </w:p>
+        </w:tc>
+        <w:tc>
+          <w:tcPr>
+            <w:tcW w:type="dxa" w:w="2948"/>
+          </w:tcPr>
+          <w:p>
+            <w:r/>
+            <w:r>
+              <w:rPr>
+                <w:sz w:val="17"/>
+              </w:rPr>
+              <w:t>4 palées + poutre au vent (2 travées)</w:t>
+            </w:r>
+          </w:p>
+        </w:tc>
+        <w:tc>
+          <w:tcPr>
+            <w:tcW w:type="dxa" w:w="3515"/>
+          </w:tcPr>
+          <w:p>
+            <w:r/>
+            <w:r>
+              <w:rPr>
+                <w:sz w:val="17"/>
+              </w:rPr>
+              <w:t>Goussets 8 mm, boulons M12</w:t>
+            </w:r>
+          </w:p>
+        </w:tc>
+        <w:tc>
+          <w:tcPr>
+            <w:tcW w:type="dxa" w:w="1814"/>
+          </w:tcPr>
+          <w:p>
+            <w:r/>
+            <w:r>
+              <w:rPr>
+                <w:sz w:val="17"/>
+              </w:rPr>
+              <w:t>S235, peint</w:t>
+            </w:r>
+          </w:p>
+        </w:tc>
+      </w:tr>
+      <w:tr>
+        <w:tc>
+          <w:tcPr>
+            <w:tcW w:type="dxa" w:w="2381"/>
           </w:tcPr>
           <w:p>
             <w:r/>
@@ -923,7 +1313,7 @@
         </w:tc>
         <w:tc>
           <w:tcPr>
-            <w:tcW w:type="dxa" w:w="2381"/>
+            <w:tcW w:type="dxa" w:w="2608"/>
           </w:tcPr>
           <w:p>
             <w:r/>
@@ -931,13 +1321,13 @@
               <w:rPr>
                 <w:sz w:val="17"/>
               </w:rPr>
-              <w:t>0,40 x 0,20</w:t>
+              <w:t>0,40 x 0,15</w:t>
             </w:r>
           </w:p>
         </w:tc>
         <w:tc>
           <w:tcPr>
-            <w:tcW w:type="dxa" w:w="3118"/>
+            <w:tcW w:type="dxa" w:w="2948"/>
           </w:tcPr>
           <w:p>
             <w:r/>
@@ -951,7 +1341,7 @@
         </w:tc>
         <w:tc>
           <w:tcPr>
-            <w:tcW w:type="dxa" w:w="3685"/>
+            <w:tcW w:type="dxa" w:w="3515"/>
           </w:tcPr>
           <w:p>
             <w:r/>
@@ -965,7 +1355,7 @@
         </w:tc>
         <w:tc>
           <w:tcPr>
-            <w:tcW w:type="dxa" w:w="1417"/>
+            <w:tcW w:type="dxa" w:w="1814"/>
           </w:tcPr>
           <w:p>
             <w:r/>
@@ -973,26 +1363,12 @@
               <w:rPr>
                 <w:sz w:val="17"/>
               </w:rPr>
-              <w:t>350 kg/m³</w:t>
+              <w:t>Béton 350 kg/m³</w:t>
             </w:r>
           </w:p>
         </w:tc>
       </w:tr>
       <w:tr>
-        <w:tc>
-          <w:tcPr>
-            <w:tcW w:type="dxa" w:w="2268"/>
-          </w:tcPr>
-          <w:p>
-            <w:r/>
-            <w:r>
-              <w:rPr>
-                <w:sz w:val="17"/>
-              </w:rPr>
-              <w:t>Pilier (17 u)</w:t>
-            </w:r>
-          </w:p>
-        </w:tc>
         <w:tc>
           <w:tcPr>
             <w:tcW w:type="dxa" w:w="2381"/>
@@ -1003,71 +1379,13 @@
               <w:rPr>
                 <w:sz w:val="17"/>
               </w:rPr>
-              <w:t>15 x 40 (2 x 15 x 20)</w:t>
+              <w:t>Chaînages bas / interm. / haut</w:t>
             </w:r>
           </w:p>
         </w:tc>
         <w:tc>
           <w:tcPr>
-            <w:tcW w:type="dxa" w:w="3118"/>
-          </w:tcPr>
-          <w:p>
-            <w:r/>
-            <w:r>
-              <w:rPr>
-                <w:sz w:val="17"/>
-              </w:rPr>
-              <w:t>8 HA10</w:t>
-            </w:r>
-          </w:p>
-        </w:tc>
-        <w:tc>
-          <w:tcPr>
-            <w:tcW w:type="dxa" w:w="3685"/>
-          </w:tcPr>
-          <w:p>
-            <w:r/>
-            <w:r>
-              <w:rPr>
-                <w:sz w:val="17"/>
-              </w:rPr>
-              <w:t>2 cadres HA6 / niveau, e = 15 (10 en zones nodales)</w:t>
-            </w:r>
-          </w:p>
-        </w:tc>
-        <w:tc>
-          <w:tcPr>
-            <w:tcW w:type="dxa" w:w="1417"/>
-          </w:tcPr>
-          <w:p>
-            <w:r/>
-            <w:r>
-              <w:rPr>
-                <w:sz w:val="17"/>
-              </w:rPr>
-              <w:t>350 kg/m³</w:t>
-            </w:r>
-          </w:p>
-        </w:tc>
-      </w:tr>
-      <w:tr>
-        <w:tc>
-          <w:tcPr>
-            <w:tcW w:type="dxa" w:w="2268"/>
-          </w:tcPr>
-          <w:p>
-            <w:r/>
-            <w:r>
-              <w:rPr>
-                <w:sz w:val="17"/>
-              </w:rPr>
-              <w:t>Chaînage bas</w:t>
-            </w:r>
-          </w:p>
-        </w:tc>
-        <w:tc>
-          <w:tcPr>
-            <w:tcW w:type="dxa" w:w="2381"/>
+            <w:tcW w:type="dxa" w:w="2608"/>
           </w:tcPr>
           <w:p>
             <w:r/>
@@ -1081,7 +1399,7 @@
         </w:tc>
         <w:tc>
           <w:tcPr>
-            <w:tcW w:type="dxa" w:w="3118"/>
+            <w:tcW w:type="dxa" w:w="2948"/>
           </w:tcPr>
           <w:p>
             <w:r/>
@@ -1095,7 +1413,7 @@
         </w:tc>
         <w:tc>
           <w:tcPr>
-            <w:tcW w:type="dxa" w:w="3685"/>
+            <w:tcW w:type="dxa" w:w="3515"/>
           </w:tcPr>
           <w:p>
             <w:r/>
@@ -1109,7 +1427,7 @@
         </w:tc>
         <w:tc>
           <w:tcPr>
-            <w:tcW w:type="dxa" w:w="1417"/>
+            <w:tcW w:type="dxa" w:w="1814"/>
           </w:tcPr>
           <w:p>
             <w:r/>
@@ -1117,7 +1435,7 @@
               <w:rPr>
                 <w:sz w:val="17"/>
               </w:rPr>
-              <w:t>350 kg/m³</w:t>
+              <w:t>Béton 350 kg/m³</w:t>
             </w:r>
           </w:p>
         </w:tc>
@@ -1125,151 +1443,7 @@
       <w:tr>
         <w:tc>
           <w:tcPr>
-            <w:tcW w:type="dxa" w:w="2268"/>
-          </w:tcPr>
-          <w:p>
-            <w:r/>
-            <w:r>
-              <w:rPr>
-                <w:sz w:val="17"/>
-              </w:rPr>
-              <w:t>Chaînage intermédiaire</w:t>
-            </w:r>
-          </w:p>
-        </w:tc>
-        <w:tc>
-          <w:tcPr>
             <w:tcW w:type="dxa" w:w="2381"/>
-          </w:tcPr>
-          <w:p>
-            <w:r/>
-            <w:r>
-              <w:rPr>
-                <w:sz w:val="17"/>
-              </w:rPr>
-              <w:t>15 x 20 à +3,00</w:t>
-            </w:r>
-          </w:p>
-        </w:tc>
-        <w:tc>
-          <w:tcPr>
-            <w:tcW w:type="dxa" w:w="3118"/>
-          </w:tcPr>
-          <w:p>
-            <w:r/>
-            <w:r>
-              <w:rPr>
-                <w:sz w:val="17"/>
-              </w:rPr>
-              <w:t>4 HA10</w:t>
-            </w:r>
-          </w:p>
-        </w:tc>
-        <w:tc>
-          <w:tcPr>
-            <w:tcW w:type="dxa" w:w="3685"/>
-          </w:tcPr>
-          <w:p>
-            <w:r/>
-            <w:r>
-              <w:rPr>
-                <w:sz w:val="17"/>
-              </w:rPr>
-              <w:t>Cadres HA6 e = 20 cm</w:t>
-            </w:r>
-          </w:p>
-        </w:tc>
-        <w:tc>
-          <w:tcPr>
-            <w:tcW w:type="dxa" w:w="1417"/>
-          </w:tcPr>
-          <w:p>
-            <w:r/>
-            <w:r>
-              <w:rPr>
-                <w:sz w:val="17"/>
-              </w:rPr>
-              <w:t>350 kg/m³</w:t>
-            </w:r>
-          </w:p>
-        </w:tc>
-      </w:tr>
-      <w:tr>
-        <w:tc>
-          <w:tcPr>
-            <w:tcW w:type="dxa" w:w="2268"/>
-          </w:tcPr>
-          <w:p>
-            <w:r/>
-            <w:r>
-              <w:rPr>
-                <w:sz w:val="17"/>
-              </w:rPr>
-              <w:t>Chaînage haut</w:t>
-            </w:r>
-          </w:p>
-        </w:tc>
-        <w:tc>
-          <w:tcPr>
-            <w:tcW w:type="dxa" w:w="2381"/>
-          </w:tcPr>
-          <w:p>
-            <w:r/>
-            <w:r>
-              <w:rPr>
-                <w:sz w:val="17"/>
-              </w:rPr>
-              <w:t>15 x 20 à +5,80</w:t>
-            </w:r>
-          </w:p>
-        </w:tc>
-        <w:tc>
-          <w:tcPr>
-            <w:tcW w:type="dxa" w:w="3118"/>
-          </w:tcPr>
-          <w:p>
-            <w:r/>
-            <w:r>
-              <w:rPr>
-                <w:sz w:val="17"/>
-              </w:rPr>
-              <w:t>4 HA10</w:t>
-            </w:r>
-          </w:p>
-        </w:tc>
-        <w:tc>
-          <w:tcPr>
-            <w:tcW w:type="dxa" w:w="3685"/>
-          </w:tcPr>
-          <w:p>
-            <w:r/>
-            <w:r>
-              <w:rPr>
-                <w:sz w:val="17"/>
-              </w:rPr>
-              <w:t>Cadres HA6 e = 20 cm</w:t>
-            </w:r>
-          </w:p>
-        </w:tc>
-        <w:tc>
-          <w:tcPr>
-            <w:tcW w:type="dxa" w:w="1417"/>
-          </w:tcPr>
-          <w:p>
-            <w:r/>
-            <w:r>
-              <w:rPr>
-                <w:sz w:val="17"/>
-              </w:rPr>
-              <w:t>350 kg/m³</w:t>
-            </w:r>
-          </w:p>
-        </w:tc>
-      </w:tr>
-      <w:tr>
-        <w:tc>
-          <w:tcPr>
-            <w:tcW w:type="dxa" w:w="2268"/>
           </w:tcPr>
           <w:p>
             <w:r/>
@@ -1283,7 +1457,7 @@
         </w:tc>
         <w:tc>
           <w:tcPr>
-            <w:tcW w:type="dxa" w:w="2381"/>
+            <w:tcW w:type="dxa" w:w="2608"/>
           </w:tcPr>
           <w:p>
             <w:r/>
@@ -1297,7 +1471,7 @@
         </w:tc>
         <w:tc>
           <w:tcPr>
-            <w:tcW w:type="dxa" w:w="3118"/>
+            <w:tcW w:type="dxa" w:w="2948"/>
           </w:tcPr>
           <w:p>
             <w:r/>
@@ -1311,7 +1485,7 @@
         </w:tc>
         <w:tc>
           <w:tcPr>
-            <w:tcW w:type="dxa" w:w="3685"/>
+            <w:tcW w:type="dxa" w:w="3515"/>
           </w:tcPr>
           <w:p>
             <w:r/>
@@ -1325,7 +1499,7 @@
         </w:tc>
         <w:tc>
           <w:tcPr>
-            <w:tcW w:type="dxa" w:w="1417"/>
+            <w:tcW w:type="dxa" w:w="1814"/>
           </w:tcPr>
           <w:p>
             <w:r/>
@@ -1333,26 +1507,12 @@
               <w:rPr>
                 <w:sz w:val="17"/>
               </w:rPr>
-              <w:t>350 kg/m³</w:t>
+              <w:t>Béton 350 kg/m³</w:t>
             </w:r>
           </w:p>
         </w:tc>
       </w:tr>
       <w:tr>
-        <w:tc>
-          <w:tcPr>
-            <w:tcW w:type="dxa" w:w="2268"/>
-          </w:tcPr>
-          <w:p>
-            <w:r/>
-            <w:r>
-              <w:rPr>
-                <w:sz w:val="17"/>
-              </w:rPr>
-              <w:t>Chaînages rampants</w:t>
-            </w:r>
-          </w:p>
-        </w:tc>
         <w:tc>
           <w:tcPr>
             <w:tcW w:type="dxa" w:w="2381"/>
@@ -1363,13 +1523,13 @@
               <w:rPr>
                 <w:sz w:val="17"/>
               </w:rPr>
-              <w:t>15 x 15, pente 20 %</w:t>
+              <w:t>Dallage</w:t>
             </w:r>
           </w:p>
         </w:tc>
         <w:tc>
           <w:tcPr>
-            <w:tcW w:type="dxa" w:w="3118"/>
+            <w:tcW w:type="dxa" w:w="2608"/>
           </w:tcPr>
           <w:p>
             <w:r/>
@@ -1377,13 +1537,13 @@
               <w:rPr>
                 <w:sz w:val="17"/>
               </w:rPr>
-              <w:t>4 HA10</w:t>
+              <w:t>ép. 20 cm, 294 m²</w:t>
             </w:r>
           </w:p>
         </w:tc>
         <w:tc>
           <w:tcPr>
-            <w:tcW w:type="dxa" w:w="3685"/>
+            <w:tcW w:type="dxa" w:w="2948"/>
           </w:tcPr>
           <w:p>
             <w:r/>
@@ -1391,13 +1551,13 @@
               <w:rPr>
                 <w:sz w:val="17"/>
               </w:rPr>
-              <w:t>Cadres HA6 e = 20 cm</w:t>
+              <w:t>2 nappes HA10 e = 20 (2 sens)</w:t>
             </w:r>
           </w:p>
         </w:tc>
         <w:tc>
           <w:tcPr>
-            <w:tcW w:type="dxa" w:w="1417"/>
+            <w:tcW w:type="dxa" w:w="3515"/>
           </w:tcPr>
           <w:p>
             <w:r/>
@@ -1405,7 +1565,165 @@
               <w:rPr>
                 <w:sz w:val="17"/>
               </w:rPr>
-              <w:t>350 kg/m³</w:t>
+              <w:t>Chaises HA10 1/m²</w:t>
+            </w:r>
+          </w:p>
+        </w:tc>
+        <w:tc>
+          <w:tcPr>
+            <w:tcW w:type="dxa" w:w="1814"/>
+          </w:tcPr>
+          <w:p>
+            <w:r/>
+            <w:r>
+              <w:rPr>
+                <w:sz w:val="17"/>
+              </w:rPr>
+              <w:t>Béton 350 kg/m³</w:t>
+            </w:r>
+          </w:p>
+        </w:tc>
+      </w:tr>
+      <w:tr>
+        <w:tc>
+          <w:tcPr>
+            <w:tcW w:type="dxa" w:w="2381"/>
+          </w:tcPr>
+          <w:p>
+            <w:r/>
+            <w:r>
+              <w:rPr>
+                <w:sz w:val="17"/>
+              </w:rPr>
+              <w:t>Pannes (option)</w:t>
+            </w:r>
+          </w:p>
+        </w:tc>
+        <w:tc>
+          <w:tcPr>
+            <w:tcW w:type="dxa" w:w="2608"/>
+          </w:tcPr>
+          <w:p>
+            <w:r/>
+            <w:r>
+              <w:rPr>
+                <w:sz w:val="17"/>
+              </w:rPr>
+              <w:t>Z 120 x 2, 12 lignes</w:t>
+            </w:r>
+          </w:p>
+        </w:tc>
+        <w:tc>
+          <w:tcPr>
+            <w:tcW w:type="dxa" w:w="2948"/>
+          </w:tcPr>
+          <w:p>
+            <w:r/>
+            <w:r>
+              <w:rPr>
+                <w:sz w:val="17"/>
+              </w:rPr>
+              <w:t>Entraxe ≤ 1,20 m</w:t>
+            </w:r>
+          </w:p>
+        </w:tc>
+        <w:tc>
+          <w:tcPr>
+            <w:tcW w:type="dxa" w:w="3515"/>
+          </w:tcPr>
+          <w:p>
+            <w:r/>
+            <w:r>
+              <w:rPr>
+                <w:sz w:val="17"/>
+              </w:rPr>
+              <w:t>Échantignoles boulonnées</w:t>
+            </w:r>
+          </w:p>
+        </w:tc>
+        <w:tc>
+          <w:tcPr>
+            <w:tcW w:type="dxa" w:w="1814"/>
+          </w:tcPr>
+          <w:p>
+            <w:r/>
+            <w:r>
+              <w:rPr>
+                <w:sz w:val="17"/>
+              </w:rPr>
+              <w:t>Galvanisé</w:t>
+            </w:r>
+          </w:p>
+        </w:tc>
+      </w:tr>
+      <w:tr>
+        <w:tc>
+          <w:tcPr>
+            <w:tcW w:type="dxa" w:w="2381"/>
+          </w:tcPr>
+          <w:p>
+            <w:r/>
+            <w:r>
+              <w:rPr>
+                <w:sz w:val="17"/>
+              </w:rPr>
+              <w:t>Couverture (option)</w:t>
+            </w:r>
+          </w:p>
+        </w:tc>
+        <w:tc>
+          <w:tcPr>
+            <w:tcW w:type="dxa" w:w="2608"/>
+          </w:tcPr>
+          <w:p>
+            <w:r/>
+            <w:r>
+              <w:rPr>
+                <w:sz w:val="17"/>
+              </w:rPr>
+              <w:t>≈ 347 m²</w:t>
+            </w:r>
+          </w:p>
+        </w:tc>
+        <w:tc>
+          <w:tcPr>
+            <w:tcW w:type="dxa" w:w="2948"/>
+          </w:tcPr>
+          <w:p>
+            <w:r/>
+            <w:r>
+              <w:rPr>
+                <w:sz w:val="17"/>
+              </w:rPr>
+              <w:t>Tôles bacs 5 ondulations</w:t>
+            </w:r>
+          </w:p>
+        </w:tc>
+        <w:tc>
+          <w:tcPr>
+            <w:tcW w:type="dxa" w:w="3515"/>
+          </w:tcPr>
+          <w:p>
+            <w:r/>
+            <w:r>
+              <w:rPr>
+                <w:sz w:val="17"/>
+              </w:rPr>
+              <w:t>Faîtière, fixations</w:t>
+            </w:r>
+          </w:p>
+        </w:tc>
+        <w:tc>
+          <w:tcPr>
+            <w:tcW w:type="dxa" w:w="1814"/>
+          </w:tcPr>
+          <w:p>
+            <w:r/>
+            <w:r>
+              <w:rPr>
+                <w:sz w:val="17"/>
+              </w:rPr>
+              <w:t>-</w:t>
             </w:r>
           </w:p>
         </w:tc>
@@ -1417,7 +1735,7 @@
         <w:pStyle w:val="Heading1"/>
       </w:pPr>
       <w:r>
-        <w:t>5. Vérifications sommaires (BAEL 91 mod. 99 / EC2)</w:t>
+        <w:t>5. Vérifications sommaires (BAEL 91 mod. 99 / EC2 / EC3)</w:t>
       </w:r>
     </w:p>
     <w:tbl>
@@ -1438,7 +1756,7 @@
         </w:trPr>
         <w:tc>
           <w:tcPr>
-            <w:tcW w:type="dxa" w:w="3118"/>
+            <w:tcW w:type="dxa" w:w="2835"/>
             <w:shd w:val="clear" w:color="auto" w:fill="1F3A5F"/>
           </w:tcPr>
           <w:p>
@@ -1458,7 +1776,7 @@
         </w:tc>
         <w:tc>
           <w:tcPr>
-            <w:tcW w:type="dxa" w:w="8220"/>
+            <w:tcW w:type="dxa" w:w="8504"/>
             <w:shd w:val="clear" w:color="auto" w:fill="1F3A5F"/>
           </w:tcPr>
           <w:p>
@@ -1500,7 +1818,7 @@
       <w:tr>
         <w:tc>
           <w:tcPr>
-            <w:tcW w:type="dxa" w:w="3118"/>
+            <w:tcW w:type="dxa" w:w="2835"/>
           </w:tcPr>
           <w:p>
             <w:r/>
@@ -1508,13 +1826,13 @@
               <w:rPr>
                 <w:sz w:val="17"/>
               </w:rPr>
-              <w:t>Pourcentage mini chaînage 15 x 20</w:t>
+              <w:t>Semelle 80 x 80 - sol</w:t>
             </w:r>
           </w:p>
         </w:tc>
         <w:tc>
           <w:tcPr>
-            <w:tcW w:type="dxa" w:w="8220"/>
+            <w:tcW w:type="dxa" w:w="8504"/>
           </w:tcPr>
           <w:p>
             <w:r/>
@@ -1522,7 +1840,95 @@
               <w:rPr>
                 <w:sz w:val="17"/>
               </w:rPr>
-              <w:t>4 HA10 = 3,14 cm² → 1,05 % &gt; 0,2 % (BAEL) et &gt; 0,26 fctm/fyk·b·d (EC2)</w:t>
+              <w:t>Nser ≈ 42 kN (G) + 25 kN (Q) = 67 kN → σ = 0,067 / 0,64 = 0,105 MPa ≈ 1,05 bar &lt; 1,5 bar</w:t>
+            </w:r>
+          </w:p>
+        </w:tc>
+        <w:tc>
+          <w:tcPr>
+            <w:tcW w:type="dxa" w:w="1984"/>
+          </w:tcPr>
+          <w:p>
+            <w:r/>
+            <w:r>
+              <w:rPr>
+                <w:sz w:val="17"/>
+              </w:rPr>
+              <w:t>Vérifié (sol à confirmer)</w:t>
+            </w:r>
+          </w:p>
+        </w:tc>
+      </w:tr>
+      <w:tr>
+        <w:tc>
+          <w:tcPr>
+            <w:tcW w:type="dxa" w:w="2835"/>
+          </w:tcPr>
+          <w:p>
+            <w:r/>
+            <w:r>
+              <w:rPr>
+                <w:sz w:val="17"/>
+              </w:rPr>
+              <w:t>Semelle 80 x 80 - aciers</w:t>
+            </w:r>
+          </w:p>
+        </w:tc>
+        <w:tc>
+          <w:tcPr>
+            <w:tcW w:type="dxa" w:w="8504"/>
+          </w:tcPr>
+          <w:p>
+            <w:r/>
+            <w:r>
+              <w:rPr>
+                <w:sz w:val="17"/>
+              </w:rPr>
+              <w:t>Nu ≈ 1,35 x 42 + 1,5 x 25 = 94 kN ; bielles : As = Nu (A - a) / (8 d fsu) = 0,094 x 0,40 / (8 x 0,25 x 435) = 0,43 cm² &lt; 6 HA12 = 6,79 cm²</w:t>
+            </w:r>
+          </w:p>
+        </w:tc>
+        <w:tc>
+          <w:tcPr>
+            <w:tcW w:type="dxa" w:w="1984"/>
+          </w:tcPr>
+          <w:p>
+            <w:r/>
+            <w:r>
+              <w:rPr>
+                <w:sz w:val="17"/>
+              </w:rPr>
+              <w:t>Vérifié (largement)</w:t>
+            </w:r>
+          </w:p>
+        </w:tc>
+      </w:tr>
+      <w:tr>
+        <w:tc>
+          <w:tcPr>
+            <w:tcW w:type="dxa" w:w="2835"/>
+          </w:tcPr>
+          <w:p>
+            <w:r/>
+            <w:r>
+              <w:rPr>
+                <w:sz w:val="17"/>
+              </w:rPr>
+              <w:t>IPE 220 - flexion (vent)</w:t>
+            </w:r>
+          </w:p>
+        </w:tc>
+        <w:tc>
+          <w:tcPr>
+            <w:tcW w:type="dxa" w:w="8504"/>
+          </w:tcPr>
+          <w:p>
+            <w:r/>
+            <w:r>
+              <w:rPr>
+                <w:sz w:val="17"/>
+              </w:rPr>
+              <w:t>w = 1,5 x 0,6 kN/m² x 5 m = 4,5 kN/m ; M = 4,5 x 6² / 8 = 20,3 kN·m &lt; Mpl = 285 cm³ x 235 = 67 kN·m</w:t>
             </w:r>
           </w:p>
         </w:tc>
@@ -1544,7 +1950,7 @@
       <w:tr>
         <w:tc>
           <w:tcPr>
-            <w:tcW w:type="dxa" w:w="3118"/>
+            <w:tcW w:type="dxa" w:w="2835"/>
           </w:tcPr>
           <w:p>
             <w:r/>
@@ -1552,13 +1958,13 @@
               <w:rPr>
                 <w:sz w:val="17"/>
               </w:rPr>
-              <w:t>Pourcentage pilier 15 x 40</w:t>
+              <w:t>IPE 220 - flambement axe faible</w:t>
             </w:r>
           </w:p>
         </w:tc>
         <w:tc>
           <w:tcPr>
-            <w:tcW w:type="dxa" w:w="8220"/>
+            <w:tcW w:type="dxa" w:w="8504"/>
           </w:tcPr>
           <w:p>
             <w:r/>
@@ -1566,7 +1972,7 @@
               <w:rPr>
                 <w:sz w:val="17"/>
               </w:rPr>
-              <w:t>8 HA10 = 6,28 cm² → 1,05 % ; 0,2 % &lt; ρ &lt; 5 %</w:t>
+              <w:t>l0 = 3,00 m (tenu par les chaînages) ; λ̄z = 1,29 ; χ ≈ 0,42 → Nb,Rd ≈ 330 kN &gt; 94 kN</w:t>
             </w:r>
           </w:p>
         </w:tc>
@@ -1588,7 +1994,7 @@
       <w:tr>
         <w:tc>
           <w:tcPr>
-            <w:tcW w:type="dxa" w:w="3118"/>
+            <w:tcW w:type="dxa" w:w="2835"/>
           </w:tcPr>
           <w:p>
             <w:r/>
@@ -1596,13 +2002,13 @@
               <w:rPr>
                 <w:sz w:val="17"/>
               </w:rPr>
-              <w:t>Diamètre des cadres</w:t>
+              <w:t>Cornière 50 x 50 x 5 (traction)</w:t>
             </w:r>
           </w:p>
         </w:tc>
         <w:tc>
           <w:tcPr>
-            <w:tcW w:type="dxa" w:w="8220"/>
+            <w:tcW w:type="dxa" w:w="8504"/>
           </w:tcPr>
           <w:p>
             <w:r/>
@@ -1610,7 +2016,7 @@
               <w:rPr>
                 <w:sz w:val="17"/>
               </w:rPr>
-              <w:t>Øt = 6 mm ≥ Øl/3 = 3,3 mm (BAEL) et ≥ max(6 ; Øl/4) (EC2)</w:t>
+              <w:t>A = 4,80 cm² → Npl = 113 kN ; effort diagonal estimé ≈ 19 kN</w:t>
             </w:r>
           </w:p>
         </w:tc>
@@ -1632,7 +2038,7 @@
       <w:tr>
         <w:tc>
           <w:tcPr>
-            <w:tcW w:type="dxa" w:w="3118"/>
+            <w:tcW w:type="dxa" w:w="2835"/>
           </w:tcPr>
           <w:p>
             <w:r/>
@@ -1640,13 +2046,13 @@
               <w:rPr>
                 <w:sz w:val="17"/>
               </w:rPr>
-              <w:t>Espacement des cadres de pilier</w:t>
+              <w:t>Panne Z 120 x 2</w:t>
             </w:r>
           </w:p>
         </w:tc>
         <w:tc>
           <w:tcPr>
-            <w:tcW w:type="dxa" w:w="8220"/>
+            <w:tcW w:type="dxa" w:w="8504"/>
           </w:tcPr>
           <w:p>
             <w:r/>
@@ -1654,7 +2060,7 @@
               <w:rPr>
                 <w:sz w:val="17"/>
               </w:rPr>
-              <w:t>st ≤ min(15 Øl = 15 cm ; a + 10 = 25 cm ; 40 cm) = 15 cm (BAEL) ; EC2 : scl,max = min(20 Øl ; b ; 400) = 15 cm</w:t>
+              <w:t>qu ≈ 1,14 kN/m sur 5,00 m → M ≈ 3,6 kN·m ; W requis ≈ 15 cm³ (Z 120 x 2 : W ≈ 19 cm³)</w:t>
             </w:r>
           </w:p>
         </w:tc>
@@ -1668,7 +2074,7 @@
               <w:rPr>
                 <w:sz w:val="17"/>
               </w:rPr>
-              <w:t>e = 15 cm retenu</w:t>
+              <w:t>Vérifié - liernes à mi-portée</w:t>
             </w:r>
           </w:p>
         </w:tc>
@@ -1676,7 +2082,7 @@
       <w:tr>
         <w:tc>
           <w:tcPr>
-            <w:tcW w:type="dxa" w:w="3118"/>
+            <w:tcW w:type="dxa" w:w="2835"/>
           </w:tcPr>
           <w:p>
             <w:r/>
@@ -1684,13 +2090,13 @@
               <w:rPr>
                 <w:sz w:val="17"/>
               </w:rPr>
-              <w:t>Élancement pilier (sens faible)</w:t>
+              <w:t>Poteaux BA 15 x 15</w:t>
             </w:r>
           </w:p>
         </w:tc>
         <w:tc>
           <w:tcPr>
-            <w:tcW w:type="dxa" w:w="8220"/>
+            <w:tcW w:type="dxa" w:w="8504"/>
           </w:tcPr>
           <w:p>
             <w:r/>
@@ -1698,51 +2104,7 @@
               <w:rPr>
                 <w:sz w:val="17"/>
               </w:rPr>
-              <w:t>lf ≈ 0,7 x 3,00 = 2,10 m ; λ = 2,10 x √12 / 0,15 = 48,5 &lt; 50</w:t>
-            </w:r>
-          </w:p>
-        </w:tc>
-        <w:tc>
-          <w:tcPr>
-            <w:tcW w:type="dxa" w:w="1984"/>
-          </w:tcPr>
-          <w:p>
-            <w:r/>
-            <w:r>
-              <w:rPr>
-                <w:sz w:val="17"/>
-              </w:rPr>
-              <w:t>Vérifié (BAEL)</w:t>
-            </w:r>
-          </w:p>
-        </w:tc>
-      </w:tr>
-      <w:tr>
-        <w:tc>
-          <w:tcPr>
-            <w:tcW w:type="dxa" w:w="3118"/>
-          </w:tcPr>
-          <w:p>
-            <w:r/>
-            <w:r>
-              <w:rPr>
-                <w:sz w:val="17"/>
-              </w:rPr>
-              <w:t>Linteau 6,00 m (ELU)</w:t>
-            </w:r>
-          </w:p>
-        </w:tc>
-        <w:tc>
-          <w:tcPr>
-            <w:tcW w:type="dxa" w:w="8220"/>
-          </w:tcPr>
-          <w:p>
-            <w:r/>
-            <w:r>
-              <w:rPr>
-                <w:sz w:val="17"/>
-              </w:rPr>
-              <w:t>pu ≈ 7,0 kN/m → Mu = 7,0 x 6,20² / 8 = 33,6 kN·m ; μ = 0,123 ; As = 2,33 cm² &lt; 6 HA10 = 4,71 cm²</w:t>
+              <w:t>4 HA10 = 3,14 cm² → ρ = 1,4 % ; λ = 0,7 x 3,00 x √12 / 0,15 = 48,5 &lt; 50 ; st = 15 cm ≤ 15 Øl</w:t>
             </w:r>
           </w:p>
         </w:tc>
@@ -1764,7 +2126,95 @@
       <w:tr>
         <w:tc>
           <w:tcPr>
-            <w:tcW w:type="dxa" w:w="3118"/>
+            <w:tcW w:type="dxa" w:w="2835"/>
+          </w:tcPr>
+          <w:p>
+            <w:r/>
+            <w:r>
+              <w:rPr>
+                <w:sz w:val="17"/>
+              </w:rPr>
+              <w:t>Dallage</w:t>
+            </w:r>
+          </w:p>
+        </w:tc>
+        <w:tc>
+          <w:tcPr>
+            <w:tcW w:type="dxa" w:w="8504"/>
+          </w:tcPr>
+          <w:p>
+            <w:r/>
+            <w:r>
+              <w:rPr>
+                <w:sz w:val="17"/>
+              </w:rPr>
+              <w:t>Double nappe HA10 e = 20 : 3,93 cm²/m par nappe et par sens &gt; Amin = 0,13 % x 20 x 100 = 2,6 cm²/m (EC2)</w:t>
+            </w:r>
+          </w:p>
+        </w:tc>
+        <w:tc>
+          <w:tcPr>
+            <w:tcW w:type="dxa" w:w="1984"/>
+          </w:tcPr>
+          <w:p>
+            <w:r/>
+            <w:r>
+              <w:rPr>
+                <w:sz w:val="17"/>
+              </w:rPr>
+              <w:t>Vérifié</w:t>
+            </w:r>
+          </w:p>
+        </w:tc>
+      </w:tr>
+      <w:tr>
+        <w:tc>
+          <w:tcPr>
+            <w:tcW w:type="dxa" w:w="2835"/>
+          </w:tcPr>
+          <w:p>
+            <w:r/>
+            <w:r>
+              <w:rPr>
+                <w:sz w:val="17"/>
+              </w:rPr>
+              <w:t>Linteau 6,00 m (ELU)</w:t>
+            </w:r>
+          </w:p>
+        </w:tc>
+        <w:tc>
+          <w:tcPr>
+            <w:tcW w:type="dxa" w:w="8504"/>
+          </w:tcPr>
+          <w:p>
+            <w:r/>
+            <w:r>
+              <w:rPr>
+                <w:sz w:val="17"/>
+              </w:rPr>
+              <w:t>Mu ≈ 33,6 kN·m ; As = 2,33 cm² &lt; 6 HA10 = 4,71 cm²</w:t>
+            </w:r>
+          </w:p>
+        </w:tc>
+        <w:tc>
+          <w:tcPr>
+            <w:tcW w:type="dxa" w:w="1984"/>
+          </w:tcPr>
+          <w:p>
+            <w:r/>
+            <w:r>
+              <w:rPr>
+                <w:sz w:val="17"/>
+              </w:rPr>
+              <w:t>Vérifié</w:t>
+            </w:r>
+          </w:p>
+        </w:tc>
+      </w:tr>
+      <w:tr>
+        <w:tc>
+          <w:tcPr>
+            <w:tcW w:type="dxa" w:w="2835"/>
           </w:tcPr>
           <w:p>
             <w:r/>
@@ -1778,7 +2228,7 @@
         </w:tc>
         <w:tc>
           <w:tcPr>
-            <w:tcW w:type="dxa" w:w="8220"/>
+            <w:tcW w:type="dxa" w:w="8504"/>
           </w:tcPr>
           <w:p>
             <w:r/>
@@ -1786,7 +2236,7 @@
               <w:rPr>
                 <w:sz w:val="17"/>
               </w:rPr>
-              <w:t>Fondations : 4 cm (XC2, sol latéritique humide) ; élévation : 3 cm (XC3/XC4 climat tropical)</w:t>
+              <w:t>Fondations 4 cm (XC2, sol latéritique humide) ; élévation et dallage 3 cm (climat tropical)</w:t>
             </w:r>
           </w:p>
         </w:tc>
@@ -1812,7 +2262,7 @@
         <w:rPr>
           <w:i/>
         </w:rPr>
-        <w:t>Ces vérifications sont sommaires : la charpente (ratio 17 kg/m²), les réactions d'appui sur les piliers et la contrainte admissible du sol (hypothèse σsol ≥ 1,5 bar sur latérite) doivent être confirmées par une note de calcul et une reconnaissance géotechnique avant exécution.</w:t>
+        <w:t>Vérifications sommaires : les charges de la charpente, la pression du vent (NV 65 / EC1 adaptés à la Côte d'Ivoire) et la portance du sol doivent être confirmées par une note de calcul complète et une étude de sol (essais LBTP) avant exécution.</w:t>
       </w:r>
     </w:p>
     <w:p>
@@ -1828,7 +2278,7 @@
         <w:pStyle w:val="ListBullet"/>
       </w:pPr>
       <w:r>
-        <w:t>Sol latéritique : purger les poches argileuses ou organiques, arroser et compacter le fond de fouille avant le béton de propreté.</w:t>
+        <w:t>Sol latéritique : purger les poches argileuses ou organiques ; rechargement par couches de 20 cm arrosées et compactées à 95 % de l'OPM, avec un contrôle de densité par couche.</w:t>
       </w:r>
     </w:p>
     <w:p>
@@ -1836,7 +2286,7 @@
         <w:pStyle w:val="ListBullet"/>
       </w:pPr>
       <w:r>
-        <w:t>Chaleur tropicale : cure humide du béton pendant au moins 7 jours (arrosage, sacs mouillés) ; éviter le bétonnage entre 12 h et 15 h.</w:t>
+        <w:t>Tiges d'ancrage : poser avec un gabarit en contreplaqué, vérifier l'implantation et les niveaux avant bétonnage des fûts.</w:t>
       </w:r>
     </w:p>
     <w:p>
@@ -1844,7 +2294,7 @@
         <w:pStyle w:val="ListBullet"/>
       </w:pPr>
       <w:r>
-        <w:t>Agglos : fabrication au moins 28 jours avant la pose, arrosage pendant 7 jours, humidification avant pose.</w:t>
+        <w:t>Acier : décapage et 2 couches d'antirouille + finition (humidité et air salin à Abidjan).</w:t>
       </w:r>
     </w:p>
     <w:p>
@@ -1852,7 +2302,7 @@
         <w:pStyle w:val="ListBullet"/>
       </w:pPr>
       <w:r>
-        <w:t>Arase étanche hydrofugée sur le chaînage bas contre les remontées capillaires (saison des pluies).</w:t>
+        <w:t>Chaleur tropicale : cure humide du béton et du dallage pendant au moins 7 jours ; sciage des joints sous 24 h.</w:t>
       </w:r>
     </w:p>
     <w:p>
@@ -1860,7 +2310,7 @@
         <w:pStyle w:val="ListBullet"/>
       </w:pPr>
       <w:r>
-        <w:t>Traitement anti-termites des fouilles et sous dallage.</w:t>
+        <w:t>Agglos : fabrication au moins 28 jours avant pose, arrosage 7 jours ; arase étanche hydrofugée sur le chaînage bas.</w:t>
       </w:r>
     </w:p>
     <w:p>
@@ -1868,7 +2318,7 @@
         <w:pStyle w:val="ListBullet"/>
       </w:pPr>
       <w:r>
-        <w:t>Toiture pente 20 % : bonne évacuation des fortes pluies ; prévoir gouttières et descentes EP (non chiffrées).</w:t>
+        <w:t>Traitement anti-termites des fouilles et sous dallage ; gouttières et descentes EP à prévoir (non chiffrées).</w:t>
       </w:r>
     </w:p>
     <w:sectPr>

</xml_diff>

<commit_message>
Bâtiment 30x10 : en-tête et identité Asseya Silver Construction sur tous les documents
Logo, coordonnées, N° CC, RCCM, banque et régime fiscal repris du devis ASC
du 16/02/2026 ; zone cachet/signature entreprise ; auteur Moulo Jean Claude.

Co-Authored-By: Claude Opus 5.5 <noreply@anthropic.com>
Claude-Session: https://claude.ai/code/session_01Y2qTq9Y3zXHLMLHGTW5fBh
</commit_message>
<xml_diff>
--- a/docs/projets/batiment-industriel-30x10/01_Esquisse_Batiment_Industriel_30x10.docx
+++ b/docs/projets/batiment-industriel-30x10/01_Esquisse_Batiment_Industriel_30x10.docx
@@ -2321,6 +2321,100 @@
         <w:t>Traitement anti-termites des fouilles et sous dallage ; gouttières et descentes EP à prévoir (non chiffrées).</w:t>
       </w:r>
     </w:p>
+    <w:p/>
+    <w:p>
+      <w:pPr>
+        <w:jc w:val="right"/>
+      </w:pPr>
+      <w:r>
+        <w:t>Fait à Abidjan, le 04/10/2026</w:t>
+      </w:r>
+    </w:p>
+    <w:tbl>
+      <w:tblPr>
+        <w:tblW w:type="auto" w:w="0"/>
+        <w:jc w:val="center"/>
+        <w:tblLook w:firstColumn="1" w:firstRow="1" w:lastColumn="0" w:lastRow="0" w:noHBand="0" w:noVBand="1" w:val="04A0"/>
+      </w:tblPr>
+      <w:tblGrid>
+        <w:gridCol w:w="7399"/>
+        <w:gridCol w:w="7399"/>
+      </w:tblGrid>
+      <w:tr>
+        <w:tc>
+          <w:tcPr>
+            <w:tcW w:type="dxa" w:w="7399"/>
+          </w:tcPr>
+          <w:p>
+            <w:pPr>
+              <w:jc w:val="center"/>
+            </w:pPr>
+            <w:r>
+              <w:rPr>
+                <w:b/>
+                <w:color w:val="1F3A5F"/>
+              </w:rPr>
+              <w:t>Établi par</w:t>
+            </w:r>
+          </w:p>
+        </w:tc>
+        <w:tc>
+          <w:tcPr>
+            <w:tcW w:type="dxa" w:w="7399"/>
+          </w:tcPr>
+          <w:p>
+            <w:pPr>
+              <w:jc w:val="center"/>
+            </w:pPr>
+            <w:r>
+              <w:rPr>
+                <w:b/>
+                <w:color w:val="1F3A5F"/>
+              </w:rPr>
+              <w:t>Pour ASSEYA SILVER CONSTRUCTION</w:t>
+            </w:r>
+          </w:p>
+        </w:tc>
+      </w:tr>
+      <w:tr>
+        <w:tc>
+          <w:tcPr>
+            <w:tcW w:type="dxa" w:w="7399"/>
+          </w:tcPr>
+          <w:p>
+            <w:pPr>
+              <w:jc w:val="center"/>
+            </w:pPr>
+            <w:r>
+              <w:t>Moulo Jean Claude</w:t>
+              <w:br/>
+              <w:t>Technicien Génie Civil BTP</w:t>
+              <w:br/>
+              <w:br/>
+              <w:br/>
+              <w:br/>
+            </w:r>
+          </w:p>
+        </w:tc>
+        <w:tc>
+          <w:tcPr>
+            <w:tcW w:type="dxa" w:w="7399"/>
+          </w:tcPr>
+          <w:p>
+            <w:pPr>
+              <w:jc w:val="center"/>
+            </w:pPr>
+            <w:r>
+              <w:t>Cachet et signature du responsable</w:t>
+              <w:br/>
+              <w:br/>
+              <w:br/>
+              <w:br/>
+            </w:r>
+          </w:p>
+        </w:tc>
+      </w:tr>
+    </w:tbl>
     <w:sectPr>
       <w:headerReference w:type="default" r:id="rId9"/>
       <w:footerReference w:type="default" r:id="rId10"/>
@@ -2340,6 +2434,15 @@
       <w:pStyle w:val="Footer"/>
       <w:jc w:val="center"/>
     </w:pPr>
+    <w:r>
+      <w:rPr>
+        <w:sz w:val="14"/>
+      </w:rPr>
+      <w:t>ASSEYA SILVER CONSTRUCTION - Bouaké - Tél : 07 08 39 02 66 / 05 05 10 76 82 - Email : asseyasilver@gmail.com</w:t>
+      <w:br/>
+      <w:t>N° CC : 2245191 D - RCCM : CI-BKE-01-2022-B13-00153 - Bank of Africa - compte n° 004619070000 - Impôts : TEE - Bouaké 1</w:t>
+      <w:br/>
+    </w:r>
     <w:r>
       <w:rPr>
         <w:sz w:val="16"/>
@@ -2386,7 +2489,7 @@
       <w:tblLook w:firstColumn="1" w:firstRow="1" w:lastColumn="0" w:lastRow="0" w:noHBand="0" w:noVBand="1" w:val="04A0"/>
     </w:tblPr>
     <w:tblGrid>
-      <w:gridCol w:w="7399"/>
+      <w:gridCol w:w="5102"/>
       <w:gridCol w:w="7399"/>
     </w:tblGrid>
     <w:tr>
@@ -2397,12 +2500,48 @@
         </w:tcPr>
         <w:p>
           <w:r>
+            <w:drawing>
+              <wp:inline xmlns:a="http://schemas.openxmlformats.org/drawingml/2006/main" xmlns:pic="http://schemas.openxmlformats.org/drawingml/2006/picture">
+                <wp:extent cx="868363" cy="576000"/>
+                <wp:docPr id="1" name="Picture 1"/>
+                <wp:cNvGraphicFramePr>
+                  <a:graphicFrameLocks noChangeAspect="1"/>
+                </wp:cNvGraphicFramePr>
+                <a:graphic>
+                  <a:graphicData uri="http://schemas.openxmlformats.org/drawingml/2006/picture">
+                    <pic:pic>
+                      <pic:nvPicPr>
+                        <pic:cNvPr id="0" name="logo_asc.jpg"/>
+                        <pic:cNvPicPr/>
+                      </pic:nvPicPr>
+                      <pic:blipFill>
+                        <a:blip r:embed="rId1"/>
+                        <a:stretch>
+                          <a:fillRect/>
+                        </a:stretch>
+                      </pic:blipFill>
+                      <pic:spPr>
+                        <a:xfrm>
+                          <a:off x="0" y="0"/>
+                          <a:ext cx="868363" cy="576000"/>
+                        </a:xfrm>
+                        <a:prstGeom prst="rect"/>
+                      </pic:spPr>
+                    </pic:pic>
+                  </a:graphicData>
+                </a:graphic>
+              </wp:inline>
+            </w:drawing>
+          </w:r>
+        </w:p>
+        <w:p>
+          <w:r>
             <w:rPr>
               <w:b/>
               <w:color w:val="1F3A5F"/>
-              <w:sz w:val="22"/>
+              <w:sz w:val="20"/>
             </w:rPr>
-            <w:t>MOULO JEAN CLAUDE</w:t>
+            <w:t>ASSEYA SILVER CONSTRUCTION</w:t>
           </w:r>
         </w:p>
         <w:p>
@@ -2410,7 +2549,15 @@
             <w:rPr>
               <w:sz w:val="16"/>
             </w:rPr>
-            <w:t>Technicien Génie Civil BTP - Abidjan, Côte d'Ivoire</w:t>
+            <w:t>Construction métallique et bâtiment - Bouaké</w:t>
+          </w:r>
+        </w:p>
+        <w:p>
+          <w:r>
+            <w:rPr>
+              <w:sz w:val="16"/>
+            </w:rPr>
+            <w:t>Tél : 07 08 39 02 66 / 05 05 10 76 82 - asseyasilver@gmail.com</w:t>
           </w:r>
         </w:p>
       </w:tc>
@@ -2452,6 +2599,18 @@
               <w:sz w:val="16"/>
             </w:rPr>
             <w:t>Date : 04/10/2026 - Normes : BAEL 91 mod. 99 / EC2</w:t>
+          </w:r>
+        </w:p>
+        <w:p>
+          <w:pPr>
+            <w:jc w:val="right"/>
+          </w:pPr>
+          <w:r>
+            <w:rPr>
+              <w:b/>
+              <w:sz w:val="16"/>
+            </w:rPr>
+            <w:t>Établi par : Moulo Jean Claude, Technicien Génie Civil BTP</w:t>
           </w:r>
         </w:p>
       </w:tc>

</xml_diff>

<commit_message>
Bâtiment 30x10 : dallage nappe simple HA10, semelle filante 60x15, élévation en agglos 15 creux
Fondation 1 m en agglos 15 pleins conservée ; rigole élargie à 0,80 m ;
DQE, déboursé sec, esquisse et classeur Excel régénérés.

Co-Authored-By: Claude Opus 5.5 <noreply@anthropic.com>
Claude-Session: https://claude.ai/code/session_01Y2qTq9Y3zXHLMLHGTW5fBh
</commit_message>
<xml_diff>
--- a/docs/projets/batiment-industriel-30x10/01_Esquisse_Batiment_Industriel_30x10.docx
+++ b/docs/projets/batiment-industriel-30x10/01_Esquisse_Batiment_Industriel_30x10.docx
@@ -24,7 +24,7 @@
           <w:i/>
           <w:sz w:val="22"/>
         </w:rPr>
-        <w:t>Piliers IPE 220 tous les 5,00 m + poteaux BA - Murs en agglos 15 pleins - Dallage BA 20 cm - Toiture 2 versants pente 20 %</w:t>
+        <w:t>Piliers IPE 220 tous les 5,00 m + poteaux BA - Murs en agglos 15 pleins / creux - Dallage BA 20 cm - Toiture 2 versants pente 20 %</w:t>
       </w:r>
     </w:p>
     <w:p>
@@ -206,7 +206,7 @@
               <w:rPr>
                 <w:sz w:val="17"/>
               </w:rPr>
-              <w:t>Agglos 15 pleins (40 x 20 x 15) - fondation h = 1,00 m, élévation 6,00 m</w:t>
+              <w:t>Fondation : agglos 15 pleins h = 1,00 m ; élévation : agglos 15 creux h = 6,00 m (40 x 20 x 15)</w:t>
             </w:r>
           </w:p>
         </w:tc>
@@ -266,7 +266,7 @@
               <w:rPr>
                 <w:sz w:val="17"/>
               </w:rPr>
-              <w:t>Semelles isolées 80 x 80 x 30 sous piliers, fond de fouille à -1,20 m, nappe HA12 e = 15 dans les 2 sens, fût BA 40 x 40 (4 HA12) jusqu'à ±0,00 ; semelle filante 40 x 15 (4 HA10) sous les murs</w:t>
+              <w:t>Semelles isolées 80 x 80 x 30 sous piliers, fond de fouille à -1,20 m, nappe HA12 e = 15 dans les 2 sens, fût BA 40 x 40 (4 HA12) jusqu'à ±0,00 ; semelle filante 60 x 15 (4 HA10, répartiteurs HA6 e = 20) sous les murs</w:t>
             </w:r>
           </w:p>
         </w:tc>
@@ -296,7 +296,7 @@
               <w:rPr>
                 <w:sz w:val="17"/>
               </w:rPr>
-              <w:t>Béton armé 20 cm dosé à 350 kg/m³, double nappe HA10 FeE500 e = 20 cm, polyane, joints sciés 5 x 5 m</w:t>
+              <w:t>Béton armé 20 cm dosé à 350 kg/m³, nappe simple HA10 FeE500 e = 20 cm dans les 2 sens, polyane, joints sciés 5 x 5 m</w:t>
             </w:r>
           </w:p>
         </w:tc>
@@ -1321,7 +1321,7 @@
               <w:rPr>
                 <w:sz w:val="17"/>
               </w:rPr>
-              <w:t>0,40 x 0,15</w:t>
+              <w:t>0,60 x 0,15</w:t>
             </w:r>
           </w:p>
         </w:tc>
@@ -1551,7 +1551,7 @@
               <w:rPr>
                 <w:sz w:val="17"/>
               </w:rPr>
-              <w:t>2 nappes HA10 e = 20 (2 sens)</w:t>
+              <w:t>Nappe simple HA10 e = 20 (2 sens)</w:t>
             </w:r>
           </w:p>
         </w:tc>
@@ -2148,7 +2148,7 @@
               <w:rPr>
                 <w:sz w:val="17"/>
               </w:rPr>
-              <w:t>Double nappe HA10 e = 20 : 3,93 cm²/m par nappe et par sens &gt; Amin = 0,13 % x 20 x 100 = 2,6 cm²/m (EC2)</w:t>
+              <w:t>Nappe simple HA10 e = 20 : 3,93 cm²/m par sens &gt; Amin = 0,13 % x 20 x 100 = 2,6 cm²/m (EC2) ; nappe à 5 cm sous la face supérieure</w:t>
             </w:r>
           </w:p>
         </w:tc>

</xml_diff>